<commit_message>
Use static Dialogflow responses without webhook
</commit_message>
<xml_diff>
--- a/AI Report - Final.docx
+++ b/AI Report - Final.docx
@@ -606,7 +606,7 @@
                 <w:color w:val="25313C"/>
                 <w:sz w:val="18"/>
               </w:rPr>
-              <w:t>2026-08-24T20:11:04+08:00</w:t>
+              <w:t>2026-08-24T20:25:35+08:00</w:t>
             </w:r>
           </w:p>
         </w:tc>
@@ -3939,7 +3939,7 @@
         <w:widowControl/>
       </w:pPr>
       <w:r>
-        <w:t>Member 1's platform approach is represented by Dialogflow ES configuration artifacts, including intents, training phrases, four custom entities, structured parameters, controlled responses, and two webhook-enabled actions. The tested handler in src/dialogflow_webhook.py validates Dialogflow ES V2 requests and returns parameter-aware links from an official-source allowlist for programme and campus-service lookups. A public HTTPS deployment and authenticated Dialogflow request log are still required before claiming live fulfillment. The repository also contains DialogflowSimulatorClient, a transparent local pattern/Jaccard implementation used solely for offline, train-only evaluation. This simulator is reproducible but is not Google's model and provides no evidence of cloud accuracy.</w:t>
+        <w:t>Member 1's platform approach is represented by Dialogflow ES configuration artifacts, including intents, training phrases, four custom entities, eight structured parameters, entity annotations, required-slot prompting, controlled static responses, and welcome/fallback handling. Webhook fulfillment is disabled by design, avoiding an external deployment dependency during the assessed demonstration. The repository also contains DialogflowSimulatorClient, a transparent local pattern/Jaccard implementation used solely for offline, train-only evaluation. This simulator is reproducible but is not Google's model and provides no evidence of cloud accuracy.</w:t>
       </w:r>
     </w:p>
     <w:p>
@@ -10920,89 +10920,6 @@
           </w:p>
         </w:tc>
       </w:tr>
-      <w:tr>
-        <w:trPr>
-          <w:cantSplit/>
-        </w:trPr>
-        <w:tc>
-          <w:tcPr>
-            <w:tcW w:type="dxa" w:w="1750"/>
-            <w:shd w:fill="FAFBFC"/>
-            <w:tcMar>
-              <w:top w:w="80" w:type="dxa"/>
-              <w:start w:w="120" w:type="dxa"/>
-              <w:bottom w:w="80" w:type="dxa"/>
-              <w:end w:w="120" w:type="dxa"/>
-            </w:tcMar>
-            <w:vAlign w:val="center"/>
-          </w:tcPr>
-          <w:p>
-            <w:pPr>
-              <w:widowControl/>
-              <w:spacing w:after="0" w:line="259" w:lineRule="auto"/>
-            </w:pPr>
-            <w:r>
-              <w:rPr>
-                <w:color w:val="25313C"/>
-                <w:sz w:val="15"/>
-              </w:rPr>
-              <w:t>Setup/Documentation Source</w:t>
-            </w:r>
-          </w:p>
-        </w:tc>
-        <w:tc>
-          <w:tcPr>
-            <w:tcW w:type="dxa" w:w="5260"/>
-            <w:shd w:fill="FAFBFC"/>
-            <w:tcMar>
-              <w:top w:w="80" w:type="dxa"/>
-              <w:start w:w="120" w:type="dxa"/>
-              <w:bottom w:w="80" w:type="dxa"/>
-              <w:end w:w="120" w:type="dxa"/>
-            </w:tcMar>
-            <w:vAlign w:val="center"/>
-          </w:tcPr>
-          <w:p>
-            <w:pPr>
-              <w:widowControl/>
-              <w:spacing w:after="0" w:line="259" w:lineRule="auto"/>
-            </w:pPr>
-            <w:r>
-              <w:rPr>
-                <w:color w:val="25313C"/>
-                <w:sz w:val="15"/>
-              </w:rPr>
-              <w:t>https://cloud.google.com/dialogflow/es/docs/fulfillment-overview</w:t>
-            </w:r>
-          </w:p>
-        </w:tc>
-        <w:tc>
-          <w:tcPr>
-            <w:tcW w:type="dxa" w:w="2350"/>
-            <w:shd w:fill="FAFBFC"/>
-            <w:tcMar>
-              <w:top w:w="80" w:type="dxa"/>
-              <w:start w:w="120" w:type="dxa"/>
-              <w:bottom w:w="80" w:type="dxa"/>
-              <w:end w:w="120" w:type="dxa"/>
-            </w:tcMar>
-            <w:vAlign w:val="center"/>
-          </w:tcPr>
-          <w:p>
-            <w:pPr>
-              <w:widowControl/>
-              <w:spacing w:after="0" w:line="259" w:lineRule="auto"/>
-            </w:pPr>
-            <w:r>
-              <w:rPr>
-                <w:color w:val="25313C"/>
-                <w:sz w:val="15"/>
-              </w:rPr>
-              <w:t>docs/dialogflow_setup.md</w:t>
-            </w:r>
-          </w:p>
-        </w:tc>
-      </w:tr>
     </w:tbl>
     <w:p>
       <w:pPr>
@@ -11496,7 +11413,7 @@
                 <w:color w:val="25313C"/>
                 <w:sz w:val="16"/>
               </w:rPr>
-              <w:t>Platform configuration, parameterized fulfillment, and integration track</w:t>
+              <w:t>Platform configuration, entities, parameter prompting, controlled static responses, and fallback handling</w:t>
             </w:r>
           </w:p>
         </w:tc>
@@ -11521,7 +11438,7 @@
                 <w:color w:val="25313C"/>
                 <w:sz w:val="16"/>
               </w:rPr>
-              <w:t>dialogflow_agent.zip; src/dialogflow_webhook.py; docs/dialogflow_setup.md</w:t>
+              <w:t>dialogflow_agent.zip; data/entities.json; docs/dialogflow_setup.md</w:t>
             </w:r>
           </w:p>
         </w:tc>
@@ -11839,7 +11756,7 @@
                 <w:color w:val="25313C"/>
                 <w:sz w:val="16"/>
               </w:rPr>
-              <w:t>Dialogflow ES intent/entity/response configuration; parameterized webhook handler; exported agent artifact; train-only simulator integration</w:t>
+              <w:t>Dialogflow ES intent/entity/response configuration; parameter annotations and required-slot prompting; exported agent artifact; train-only simulator integration</w:t>
             </w:r>
           </w:p>
         </w:tc>
@@ -11864,7 +11781,7 @@
                 <w:color w:val="25313C"/>
                 <w:sz w:val="16"/>
               </w:rPr>
-              <w:t>Export timestamp; webhook test; authentic console/API test; meeting log</w:t>
+              <w:t>Export timestamp; parameter-prompt test; authentic console/API test; meeting log</w:t>
             </w:r>
           </w:p>
         </w:tc>
@@ -13319,7 +13236,7 @@
         <w:widowControl/>
       </w:pPr>
       <w:r>
-        <w:t>Evaluation artifact: evaluation_results.json generated at 2026-08-24T18:02:56.633862. Builder output generated at 2026-08-24T20:11:04+08:00.</w:t>
+        <w:t>Evaluation artifact: evaluation_results.json generated at 2026-08-24T18:02:56.633862. Builder output generated at 2026-08-24T20:25:35+08:00.</w:t>
       </w:r>
     </w:p>
     <w:p>

</xml_diff>

<commit_message>
Clarify static contact-directory response
</commit_message>
<xml_diff>
--- a/AI Report - Final.docx
+++ b/AI Report - Final.docx
@@ -213,7 +213,7 @@
           <w:color w:val="25313C"/>
           <w:sz w:val="21"/>
         </w:rPr>
-        <w:t>2026-08-24T18:02:56.633862</w:t>
+        <w:t>2026-08-24T20:33:22.440563</w:t>
       </w:r>
     </w:p>
     <w:p>
@@ -551,7 +551,7 @@
                 <w:color w:val="25313C"/>
                 <w:sz w:val="18"/>
               </w:rPr>
-              <w:t>2026-08-24T18:02:56.633862</w:t>
+              <w:t>2026-08-24T20:33:22.440563</w:t>
             </w:r>
           </w:p>
         </w:tc>
@@ -606,7 +606,7 @@
                 <w:color w:val="25313C"/>
                 <w:sz w:val="18"/>
               </w:rPr>
-              <w:t>2026-08-24T20:25:35+08:00</w:t>
+              <w:t>2026-08-24T20:33:48+08:00</w:t>
             </w:r>
           </w:p>
         </w:tc>
@@ -6231,7 +6231,7 @@
         <w:widowControl/>
       </w:pPr>
       <w:r>
-        <w:t>Source: data/evaluation_results.json generated at 2026-08-24T18:02:56.633862. All classification metrics use the same recorded held-out split.</w:t>
+        <w:t>Source: data/evaluation_results.json generated at 2026-08-24T20:33:22.440563. All classification metrics use the same recorded held-out split.</w:t>
       </w:r>
     </w:p>
     <w:p>
@@ -13236,7 +13236,7 @@
         <w:widowControl/>
       </w:pPr>
       <w:r>
-        <w:t>Evaluation artifact: evaluation_results.json generated at 2026-08-24T18:02:56.633862. Builder output generated at 2026-08-24T20:25:35+08:00.</w:t>
+        <w:t>Evaluation artifact: evaluation_results.json generated at 2026-08-24T20:33:22.440563. Builder output generated at 2026-08-24T20:33:48+08:00.</w:t>
       </w:r>
     </w:p>
     <w:p>

</xml_diff>

<commit_message>
Add parameter-aware static service directory responses
</commit_message>
<xml_diff>
--- a/AI Report - Final.docx
+++ b/AI Report - Final.docx
@@ -213,7 +213,7 @@
           <w:color w:val="25313C"/>
           <w:sz w:val="21"/>
         </w:rPr>
-        <w:t>2026-08-24T20:33:22.440563</w:t>
+        <w:t>2026-08-24T20:44:20.516493</w:t>
       </w:r>
     </w:p>
     <w:p>
@@ -551,7 +551,7 @@
                 <w:color w:val="25313C"/>
                 <w:sz w:val="18"/>
               </w:rPr>
-              <w:t>2026-08-24T20:33:22.440563</w:t>
+              <w:t>2026-08-24T20:44:20.516493</w:t>
             </w:r>
           </w:p>
         </w:tc>
@@ -606,7 +606,7 @@
                 <w:color w:val="25313C"/>
                 <w:sz w:val="18"/>
               </w:rPr>
-              <w:t>2026-08-24T20:33:48+08:00</w:t>
+              <w:t>2026-08-24T20:44:48+08:00</w:t>
             </w:r>
           </w:p>
         </w:tc>
@@ -3939,7 +3939,7 @@
         <w:widowControl/>
       </w:pPr>
       <w:r>
-        <w:t>Member 1's platform approach is represented by Dialogflow ES configuration artifacts, including intents, training phrases, four custom entities, eight structured parameters, entity annotations, required-slot prompting, controlled static responses, and welcome/fallback handling. Webhook fulfillment is disabled by design, avoiding an external deployment dependency during the assessed demonstration. The repository also contains DialogflowSimulatorClient, a transparent local pattern/Jaccard implementation used solely for offline, train-only evaluation. This simulator is reproducible but is not Google's model and provides no evidence of cloud accuracy.</w:t>
+        <w:t>Member 1's platform approach is represented by Dialogflow ES configuration artifacts, including intents, training phrases, five custom entities, eight structured parameters, entity annotations, required-slot prompting, parameter-aware official-source static responses, and welcome/fallback handling. The dedicated campus-service directory entity normalises a selected service to its official URL, so a prompted answer such as 'library' returns the Library opening-hours page without a webhook. Webhook fulfillment is disabled by design, avoiding an external deployment dependency during the assessed demonstration. The repository also contains DialogflowSimulatorClient, a transparent local pattern/Jaccard implementation used solely for offline, train-only evaluation. This simulator is reproducible but is not Google's model and provides no evidence of cloud accuracy.</w:t>
       </w:r>
     </w:p>
     <w:p>
@@ -6231,7 +6231,7 @@
         <w:widowControl/>
       </w:pPr>
       <w:r>
-        <w:t>Source: data/evaluation_results.json generated at 2026-08-24T20:33:22.440563. All classification metrics use the same recorded held-out split.</w:t>
+        <w:t>Source: data/evaluation_results.json generated at 2026-08-24T20:44:20.516493. All classification metrics use the same recorded held-out split.</w:t>
       </w:r>
     </w:p>
     <w:p>
@@ -13236,7 +13236,7 @@
         <w:widowControl/>
       </w:pPr>
       <w:r>
-        <w:t>Evaluation artifact: evaluation_results.json generated at 2026-08-24T20:33:22.440563. Builder output generated at 2026-08-24T20:33:48+08:00.</w:t>
+        <w:t>Evaluation artifact: evaluation_results.json generated at 2026-08-24T20:44:20.516493. Builder output generated at 2026-08-24T20:44:48+08:00.</w:t>
       </w:r>
     </w:p>
     <w:p>

</xml_diff>